<commit_message>
Intégrer le contenu de Korrecteau_Documentation.docx dans les deux docs
Reprise de tout le contenu de l'ancien document unique, réparti entre les
deux nouvelles documentations et mis à jour selon le code actuel :

- Utilisateur : emplacement réseau du logiciel, procédure de téléchargement
  des données depuis Power BI Exploitation (3 captures d'écran incluses),
  note Windows « Éditeur inconnu », table lettre FP2E -> diamètre.
- Technique : annexe « Règles de contrôle (référence détaillée) » (règles
  communes et par mode, table FP2E), récupération du code via GitHub et
  installation de PyInstaller.

Cohérence avec le code : détection FP2E par motif (>= 3 lettres hors DME),
contrôle des communes dans les trois modes, plus de mention de l'onglet
Compteurs_FP2E supprimé.

Co-Authored-By: Claude Opus 4.8 <noreply@anthropic.com>
Claude-Session: https://claude.ai/code/session_012zamZQbmAcv3PcDU4ac4GX
</commit_message>
<xml_diff>
--- a/Documentation_Technique.docx
+++ b/Documentation_Technique.docx
@@ -872,6 +872,112 @@
     </w:p>
     <w:p>
       <w:pPr>
+        <w:pBdr>
+          <w:left w:val="single" w:color="198754" w:sz="24" w:space="10"/>
+        </w:pBdr>
+        <w:shd w:fill="E9F5EE" w:color="auto" w:val="clear"/>
+        <w:spacing w:after="140" w:before="80"/>
+      </w:pPr>
+      <w:r>
+        <w:rPr>
+          <w:b/>
+          <w:bCs/>
+          <w:color w:val="146C43"/>
+        </w:rPr>
+        <w:t xml:space="preserve">ℹ  </w:t>
+      </w:r>
+      <w:r>
+        <w:t xml:space="preserve">À faire sur un PC Windows : un .exe Windows ne peut être fabriqué que sous Windows.</w:t>
+      </w:r>
+    </w:p>
+    <w:p>
+      <w:pPr>
+        <w:pStyle w:val="Heading3"/>
+        <w:spacing w:after="80" w:before="180"/>
+      </w:pPr>
+      <w:r>
+        <w:t xml:space="preserve">Récupérer le code</w:t>
+      </w:r>
+    </w:p>
+    <w:p>
+      <w:pPr>
+        <w:pStyle w:val="ListParagraph"/>
+        <w:numPr>
+          <w:ilvl w:val="0"/>
+          <w:numId w:val="2"/>
+        </w:numPr>
+        <w:spacing w:after="60"/>
+      </w:pPr>
+      <w:r>
+        <w:rPr>
+          <w:b w:val="false"/>
+          <w:bCs w:val="false"/>
+        </w:rPr>
+        <w:t xml:space="preserve">Sur le dépôt GitHub : bouton « Code » → « Download ZIP », puis décompresser le dossier.</w:t>
+      </w:r>
+    </w:p>
+    <w:p>
+      <w:pPr>
+        <w:pStyle w:val="ListParagraph"/>
+        <w:numPr>
+          <w:ilvl w:val="0"/>
+          <w:numId w:val="2"/>
+        </w:numPr>
+        <w:spacing w:after="60"/>
+      </w:pPr>
+      <w:r>
+        <w:rPr>
+          <w:b w:val="false"/>
+          <w:bCs w:val="false"/>
+        </w:rPr>
+        <w:t xml:space="preserve">Installer Python depuis python.org en cochant « Add Python to PATH » à l’installation.</w:t>
+      </w:r>
+    </w:p>
+    <w:p>
+      <w:pPr>
+        <w:pStyle w:val="ListParagraph"/>
+        <w:numPr>
+          <w:ilvl w:val="0"/>
+          <w:numId w:val="2"/>
+        </w:numPr>
+        <w:spacing w:after="60"/>
+      </w:pPr>
+      <w:r>
+        <w:rPr>
+          <w:b w:val="false"/>
+          <w:bCs w:val="false"/>
+        </w:rPr>
+        <w:t xml:space="preserve">Ouvrir un terminal dans le dossier (taper cmd dans la barre d’adresse de l’explorateur), puis :</w:t>
+      </w:r>
+    </w:p>
+    <w:p>
+      <w:pPr>
+        <w:pBdr>
+          <w:left w:val="single" w:color="198754" w:sz="18" w:space="8"/>
+        </w:pBdr>
+        <w:shd w:fill="F1F3F5" w:color="auto" w:val="clear"/>
+        <w:spacing w:after="120"/>
+      </w:pPr>
+      <w:r>
+        <w:rPr>
+          <w:rFonts w:ascii="Consolas" w:cs="Consolas" w:eastAsia="Consolas" w:hAnsi="Consolas"/>
+          <w:sz w:val="19"/>
+          <w:szCs w:val="19"/>
+        </w:rPr>
+        <w:t xml:space="preserve">pip install -r requirements.txt</w:t>
+      </w:r>
+      <w:r>
+        <w:rPr>
+          <w:rFonts w:ascii="Consolas" w:cs="Consolas" w:eastAsia="Consolas" w:hAnsi="Consolas"/>
+          <w:sz w:val="19"/>
+          <w:szCs w:val="19"/>
+        </w:rPr>
+        <w:br/>
+        <w:t xml:space="preserve">pip install pyinstaller</w:t>
+      </w:r>
+    </w:p>
+    <w:p>
+      <w:pPr>
         <w:pStyle w:val="Heading3"/>
         <w:spacing w:after="80" w:before="180"/>
       </w:pPr>
@@ -1440,6 +1546,26 @@
     </w:p>
     <w:p>
       <w:pPr>
+        <w:pBdr>
+          <w:left w:val="single" w:color="198754" w:sz="24" w:space="10"/>
+        </w:pBdr>
+        <w:shd w:fill="E9F5EE" w:color="auto" w:val="clear"/>
+        <w:spacing w:after="140" w:before="80"/>
+      </w:pPr>
+      <w:r>
+        <w:rPr>
+          <w:b/>
+          <w:bCs/>
+          <w:color w:val="146C43"/>
+        </w:rPr>
+        <w:t xml:space="preserve">ℹ  </w:t>
+      </w:r>
+      <w:r>
+        <w:t xml:space="preserve">Au 1ᵉʳ lancement, Windows peut afficher « Éditeur inconnu » (faux positif classique de PyInstaller) : cliquer sur « Informations complémentaires » puis « Exécuter quand même ».</w:t>
+      </w:r>
+    </w:p>
+    <w:p>
+      <w:pPr>
         <w:pStyle w:val="Heading1"/>
         <w:spacing w:after="140" w:before="320"/>
       </w:pPr>
@@ -2805,6 +2931,1376 @@
                 <w:szCs w:val="19"/>
               </w:rPr>
               <w:t xml:space="preserve">Onglet ou colonne renommé : l’application retombe sur les valeurs par défaut. Restaurer les en-têtes d’origine.</w:t>
+            </w:r>
+          </w:p>
+        </w:tc>
+      </w:tr>
+    </w:tbl>
+    <w:p>
+      <w:r>
+        <w:br w:type="page"/>
+      </w:r>
+    </w:p>
+    <w:p>
+      <w:pPr>
+        <w:pStyle w:val="Heading1"/>
+        <w:spacing w:after="140" w:before="320"/>
+      </w:pPr>
+      <w:r>
+        <w:t xml:space="preserve">Annexe — Règles de contrôle appliquées (référence détaillée)</w:t>
+      </w:r>
+    </w:p>
+    <w:p>
+      <w:pPr>
+        <w:spacing w:after="120" w:line="276"/>
+      </w:pPr>
+      <w:r>
+        <w:t xml:space="preserve">Chaque contrôle génère une anomalie lorsque la condition n’est pas respectée. Les rapports Excel surlignent les cellules concernées et proposent, quand c’est possible, une valeur corrigée.</w:t>
+      </w:r>
+    </w:p>
+    <w:p>
+      <w:pPr>
+        <w:pStyle w:val="Heading2"/>
+        <w:spacing w:after="100" w:before="240"/>
+      </w:pPr>
+      <w:r>
+        <w:t xml:space="preserve">1. Règles communes (tous les modes)</w:t>
+      </w:r>
+    </w:p>
+    <w:p>
+      <w:pPr>
+        <w:pStyle w:val="ListParagraph"/>
+        <w:numPr>
+          <w:ilvl w:val="0"/>
+          <w:numId w:val="2"/>
+        </w:numPr>
+        <w:spacing w:after="60"/>
+      </w:pPr>
+      <w:r>
+        <w:rPr>
+          <w:b w:val="false"/>
+          <w:bCs w:val="false"/>
+        </w:rPr>
+        <w:t xml:space="preserve">Champs obligatoires : Marque, Numéro de compteur, Diamètre, Année de fabrication et Type Compteur doivent être renseignés.</w:t>
+      </w:r>
+    </w:p>
+    <w:p>
+      <w:pPr>
+        <w:pStyle w:val="ListParagraph"/>
+        <w:numPr>
+          <w:ilvl w:val="0"/>
+          <w:numId w:val="2"/>
+        </w:numPr>
+        <w:spacing w:after="60"/>
+      </w:pPr>
+      <w:r>
+        <w:rPr>
+          <w:b w:val="false"/>
+          <w:bCs w:val="false"/>
+        </w:rPr>
+        <w:t xml:space="preserve">Coordonnées GPS : latitude / longitude numériques, non nulles et dans les bornes (lat -90..90, lon -180..180).</w:t>
+      </w:r>
+    </w:p>
+    <w:p>
+      <w:pPr>
+        <w:pStyle w:val="ListParagraph"/>
+        <w:numPr>
+          <w:ilvl w:val="0"/>
+          <w:numId w:val="2"/>
+        </w:numPr>
+        <w:spacing w:after="60"/>
+      </w:pPr>
+      <w:r>
+        <w:rPr>
+          <w:b w:val="false"/>
+          <w:bCs w:val="false"/>
+        </w:rPr>
+        <w:t xml:space="preserve">Marque autorisée : la marque doit figurer dans la liste des marques autorisées du mode.</w:t>
+      </w:r>
+    </w:p>
+    <w:p>
+      <w:pPr>
+        <w:pStyle w:val="ListParagraph"/>
+        <w:numPr>
+          <w:ilvl w:val="0"/>
+          <w:numId w:val="2"/>
+        </w:numPr>
+        <w:spacing w:after="60"/>
+      </w:pPr>
+      <w:r>
+        <w:rPr>
+          <w:b w:val="false"/>
+          <w:bCs w:val="false"/>
+        </w:rPr>
+        <w:t xml:space="preserve">Type Compteur autorisé : le code Type Compteur doit figurer dans la liste des codes autorisés.</w:t>
+      </w:r>
+    </w:p>
+    <w:p>
+      <w:pPr>
+        <w:pStyle w:val="ListParagraph"/>
+        <w:numPr>
+          <w:ilvl w:val="0"/>
+          <w:numId w:val="2"/>
+        </w:numPr>
+        <w:spacing w:after="60"/>
+      </w:pPr>
+      <w:r>
+        <w:rPr>
+          <w:b w:val="false"/>
+          <w:bCs w:val="false"/>
+        </w:rPr>
+        <w:t xml:space="preserve">Cohérence Type Compteur : pour un compteur au format FP2E, le Type Compteur doit valoir le 1ᵉʳ + 4ᵉ caractère du numéro (ex. C22FL… → CF). Exceptions : les codes « module » (SEN3, SEN4, INT3, KM21, MAG1…) ne suivent pas cette règle.</w:t>
+      </w:r>
+    </w:p>
+    <w:p>
+      <w:pPr>
+        <w:pStyle w:val="ListParagraph"/>
+        <w:numPr>
+          <w:ilvl w:val="0"/>
+          <w:numId w:val="2"/>
+        </w:numPr>
+        <w:spacing w:after="60"/>
+      </w:pPr>
+      <w:r>
+        <w:rPr>
+          <w:b w:val="false"/>
+          <w:bCs w:val="false"/>
+        </w:rPr>
+        <w:t xml:space="preserve">Cohérence Marque / préfixe : compteur commençant par C → SAPPEL (C), H → SAPPEL (H), I ou D → ITRON.</w:t>
+      </w:r>
+    </w:p>
+    <w:p>
+      <w:pPr>
+        <w:pStyle w:val="ListParagraph"/>
+        <w:numPr>
+          <w:ilvl w:val="0"/>
+          <w:numId w:val="2"/>
+        </w:numPr>
+        <w:spacing w:after="60"/>
+      </w:pPr>
+      <w:r>
+        <w:rPr>
+          <w:b w:val="false"/>
+          <w:bCs w:val="false"/>
+        </w:rPr>
+        <w:t xml:space="preserve">Cohérence FP2E : pour un numéro FP2E, l’année (millésime) et le diamètre doivent correspondre au numéro (voir §5).</w:t>
+      </w:r>
+    </w:p>
+    <w:p>
+      <w:pPr>
+        <w:pStyle w:val="ListParagraph"/>
+        <w:numPr>
+          <w:ilvl w:val="0"/>
+          <w:numId w:val="2"/>
+        </w:numPr>
+        <w:spacing w:after="60"/>
+      </w:pPr>
+      <w:r>
+        <w:rPr>
+          <w:b w:val="false"/>
+          <w:bCs w:val="false"/>
+        </w:rPr>
+        <w:t xml:space="preserve">Format FP2E : tout numéro présumé FP2E (au moins 3 lettres, hors préfixe « DME ») doit respecter le motif attendu (1 lettre, 2 chiffres, 2 lettres, 6 chiffres) ; sinon « Format de compteur non FP2E ». KAMSTRUP / U Kamstrup ont leur contrôle dédié (préfixe « U »).</w:t>
+      </w:r>
+    </w:p>
+    <w:p>
+      <w:pPr>
+        <w:pStyle w:val="ListParagraph"/>
+        <w:numPr>
+          <w:ilvl w:val="0"/>
+          <w:numId w:val="2"/>
+        </w:numPr>
+        <w:spacing w:after="60"/>
+      </w:pPr>
+      <w:r>
+        <w:rPr>
+          <w:b w:val="false"/>
+          <w:bCs w:val="false"/>
+        </w:rPr>
+        <w:t xml:space="preserve">Commune inconnue : une commune absente de l’onglet ProtocoleRadio_commune est signalée dans les trois modes.</w:t>
+      </w:r>
+    </w:p>
+    <w:p>
+      <w:pPr>
+        <w:pStyle w:val="Heading2"/>
+        <w:spacing w:after="100" w:before="240"/>
+      </w:pPr>
+      <w:r>
+        <w:t xml:space="preserve">2. Radiorelève</w:t>
+      </w:r>
+    </w:p>
+    <w:p>
+      <w:pPr>
+        <w:pStyle w:val="ListParagraph"/>
+        <w:numPr>
+          <w:ilvl w:val="0"/>
+          <w:numId w:val="2"/>
+        </w:numPr>
+        <w:spacing w:after="60"/>
+      </w:pPr>
+      <w:r>
+        <w:rPr>
+          <w:b w:val="false"/>
+          <w:bCs w:val="false"/>
+        </w:rPr>
+        <w:t xml:space="preserve">Marques autorisées : SAPPEL (H), SAPPEL (C), KAMSTRUP, U Kamstrup.</w:t>
+      </w:r>
+    </w:p>
+    <w:p>
+      <w:pPr>
+        <w:pStyle w:val="ListParagraph"/>
+        <w:numPr>
+          <w:ilvl w:val="0"/>
+          <w:numId w:val="2"/>
+        </w:numPr>
+        <w:spacing w:after="60"/>
+      </w:pPr>
+      <w:r>
+        <w:rPr>
+          <w:b w:val="false"/>
+          <w:bCs w:val="false"/>
+        </w:rPr>
+        <w:t xml:space="preserve">Protocole radio : KAMSTRUP → WMS ; SAPPEL fabriqué en 2022 ou avant → WMS, après 2022 → OMS (configurable : onglet Protocole_par_marque).</w:t>
+      </w:r>
+    </w:p>
+    <w:p>
+      <w:pPr>
+        <w:pStyle w:val="ListParagraph"/>
+        <w:numPr>
+          <w:ilvl w:val="0"/>
+          <w:numId w:val="2"/>
+        </w:numPr>
+        <w:spacing w:after="60"/>
+      </w:pPr>
+      <w:r>
+        <w:rPr>
+          <w:b w:val="false"/>
+          <w:bCs w:val="false"/>
+        </w:rPr>
+        <w:t xml:space="preserve">KAMSTRUP (classique) : numéro de compteur = 8 caractères ; compteur = tête ; diamètre entre 15 et 80.</w:t>
+      </w:r>
+    </w:p>
+    <w:p>
+      <w:pPr>
+        <w:pStyle w:val="ListParagraph"/>
+        <w:numPr>
+          <w:ilvl w:val="0"/>
+          <w:numId w:val="2"/>
+        </w:numPr>
+        <w:spacing w:after="60"/>
+      </w:pPr>
+      <w:r>
+        <w:rPr>
+          <w:b w:val="false"/>
+          <w:bCs w:val="false"/>
+        </w:rPr>
+        <w:t xml:space="preserve">U Kamstrup : numéro de compteur = 11 caractères (12 pour Traités 965/455/899), au format FP2E ; tête = 8 chiffres.</w:t>
+      </w:r>
+    </w:p>
+    <w:p>
+      <w:pPr>
+        <w:pStyle w:val="ListParagraph"/>
+        <w:numPr>
+          <w:ilvl w:val="0"/>
+          <w:numId w:val="2"/>
+        </w:numPr>
+        <w:spacing w:after="60"/>
+      </w:pPr>
+      <w:r>
+        <w:rPr>
+          <w:b w:val="false"/>
+          <w:bCs w:val="false"/>
+        </w:rPr>
+        <w:t xml:space="preserve">SAPPEL : compteur commençant par C ou H ; tête « DME » = 15 caractères ; Type Compteur SEN4 → tête = 16 caractères.</w:t>
+      </w:r>
+    </w:p>
+    <w:p>
+      <w:pPr>
+        <w:pStyle w:val="ListParagraph"/>
+        <w:numPr>
+          <w:ilvl w:val="0"/>
+          <w:numId w:val="2"/>
+        </w:numPr>
+        <w:spacing w:after="60"/>
+      </w:pPr>
+      <w:r>
+        <w:rPr>
+          <w:b w:val="false"/>
+          <w:bCs w:val="false"/>
+        </w:rPr>
+        <w:t xml:space="preserve">ITRON : compteur commençant par I ou D.</w:t>
+      </w:r>
+    </w:p>
+    <w:p>
+      <w:pPr>
+        <w:pStyle w:val="Heading2"/>
+        <w:spacing w:after="100" w:before="240"/>
+      </w:pPr>
+      <w:r>
+        <w:t xml:space="preserve">3. Télérelève</w:t>
+      </w:r>
+    </w:p>
+    <w:p>
+      <w:pPr>
+        <w:pStyle w:val="ListParagraph"/>
+        <w:numPr>
+          <w:ilvl w:val="0"/>
+          <w:numId w:val="2"/>
+        </w:numPr>
+        <w:spacing w:after="60"/>
+      </w:pPr>
+      <w:r>
+        <w:rPr>
+          <w:b w:val="false"/>
+          <w:bCs w:val="false"/>
+        </w:rPr>
+        <w:t xml:space="preserve">Marques autorisées : INTEGRA, ITRON, KAIFA, KAMSTRUP, SAPPEL (C), SAPPEL (H), SENSUS, SOCAM, U Kamstrup.</w:t>
+      </w:r>
+    </w:p>
+    <w:p>
+      <w:pPr>
+        <w:pStyle w:val="ListParagraph"/>
+        <w:numPr>
+          <w:ilvl w:val="0"/>
+          <w:numId w:val="2"/>
+        </w:numPr>
+        <w:spacing w:after="60"/>
+      </w:pPr>
+      <w:r>
+        <w:rPr>
+          <w:b w:val="false"/>
+          <w:bCs w:val="false"/>
+        </w:rPr>
+        <w:t xml:space="preserve">Protocole radio (par commune) : le protocole de chaque ligne doit correspondre à celui de sa commune (onglet ProtocoleRadio_commune). Sinon « Protocole incorrect (devrait respecter la commune) » avec la correction. Comparaison insensible à la casse et aux accents.</w:t>
+      </w:r>
+    </w:p>
+    <w:p>
+      <w:pPr>
+        <w:pStyle w:val="ListParagraph"/>
+        <w:numPr>
+          <w:ilvl w:val="0"/>
+          <w:numId w:val="2"/>
+        </w:numPr>
+        <w:spacing w:after="60"/>
+      </w:pPr>
+      <w:r>
+        <w:rPr>
+          <w:b w:val="false"/>
+          <w:bCs w:val="false"/>
+        </w:rPr>
+        <w:t xml:space="preserve">KAMSTRUP (classique) : numéro de compteur = 8 caractères ; compteur = tête ; diamètre entre 15 et 80.</w:t>
+      </w:r>
+    </w:p>
+    <w:p>
+      <w:pPr>
+        <w:pStyle w:val="ListParagraph"/>
+        <w:numPr>
+          <w:ilvl w:val="0"/>
+          <w:numId w:val="2"/>
+        </w:numPr>
+        <w:spacing w:after="60"/>
+      </w:pPr>
+      <w:r>
+        <w:rPr>
+          <w:b w:val="false"/>
+          <w:bCs w:val="false"/>
+        </w:rPr>
+        <w:t xml:space="preserve">U Kamstrup : numéro de compteur = 11 caractères (12 pour Traités 965/455/899), au format FP2E ; tête = 8 chiffres.</w:t>
+      </w:r>
+    </w:p>
+    <w:p>
+      <w:pPr>
+        <w:pStyle w:val="ListParagraph"/>
+        <w:numPr>
+          <w:ilvl w:val="0"/>
+          <w:numId w:val="2"/>
+        </w:numPr>
+        <w:spacing w:after="60"/>
+      </w:pPr>
+      <w:r>
+        <w:rPr>
+          <w:b w:val="false"/>
+          <w:bCs w:val="false"/>
+        </w:rPr>
+        <w:t xml:space="preserve">SAPPEL : tête = 16 caractères ; Type Compteur SEN3 → tête = 15 ; Type Compteur INT3 → tête = 15.</w:t>
+      </w:r>
+    </w:p>
+    <w:p>
+      <w:pPr>
+        <w:pStyle w:val="ListParagraph"/>
+        <w:numPr>
+          <w:ilvl w:val="0"/>
+          <w:numId w:val="2"/>
+        </w:numPr>
+        <w:spacing w:after="60"/>
+      </w:pPr>
+      <w:r>
+        <w:rPr>
+          <w:b w:val="false"/>
+          <w:bCs w:val="false"/>
+        </w:rPr>
+        <w:t xml:space="preserve">ITRON : tête = 8 caractères.</w:t>
+      </w:r>
+    </w:p>
+    <w:p>
+      <w:pPr>
+        <w:pStyle w:val="Heading2"/>
+        <w:spacing w:after="100" w:before="240"/>
+      </w:pPr>
+      <w:r>
+        <w:t xml:space="preserve">4. Manuelle</w:t>
+      </w:r>
+    </w:p>
+    <w:p>
+      <w:pPr>
+        <w:pStyle w:val="ListParagraph"/>
+        <w:numPr>
+          <w:ilvl w:val="0"/>
+          <w:numId w:val="2"/>
+        </w:numPr>
+        <w:spacing w:after="60"/>
+      </w:pPr>
+      <w:r>
+        <w:rPr>
+          <w:b w:val="false"/>
+          <w:bCs w:val="false"/>
+        </w:rPr>
+        <w:t xml:space="preserve">Coordonnées GPS : latitude / longitude numériques et valides.</w:t>
+      </w:r>
+    </w:p>
+    <w:p>
+      <w:pPr>
+        <w:pStyle w:val="ListParagraph"/>
+        <w:numPr>
+          <w:ilvl w:val="0"/>
+          <w:numId w:val="2"/>
+        </w:numPr>
+        <w:spacing w:after="60"/>
+      </w:pPr>
+      <w:r>
+        <w:rPr>
+          <w:b w:val="false"/>
+          <w:bCs w:val="false"/>
+        </w:rPr>
+        <w:t xml:space="preserve">Type Compteur renseigné et dans la liste autorisée.</w:t>
+      </w:r>
+    </w:p>
+    <w:p>
+      <w:pPr>
+        <w:pStyle w:val="ListParagraph"/>
+        <w:numPr>
+          <w:ilvl w:val="0"/>
+          <w:numId w:val="2"/>
+        </w:numPr>
+        <w:spacing w:after="60"/>
+      </w:pPr>
+      <w:r>
+        <w:rPr>
+          <w:b w:val="false"/>
+          <w:bCs w:val="false"/>
+        </w:rPr>
+        <w:t xml:space="preserve">Format compteur : tout numéro présumé FP2E (≥ 3 lettres, hors « DME ») doit être au format FP2E.</w:t>
+      </w:r>
+    </w:p>
+    <w:p>
+      <w:pPr>
+        <w:pStyle w:val="ListParagraph"/>
+        <w:numPr>
+          <w:ilvl w:val="0"/>
+          <w:numId w:val="2"/>
+        </w:numPr>
+        <w:spacing w:after="60"/>
+      </w:pPr>
+      <w:r>
+        <w:rPr>
+          <w:b w:val="false"/>
+          <w:bCs w:val="false"/>
+        </w:rPr>
+        <w:t xml:space="preserve">Cohérences : préfixe C/H → SAPPEL, I/D → ITRON ; cohérence année / diamètre FP2E.</w:t>
+      </w:r>
+    </w:p>
+    <w:p>
+      <w:pPr>
+        <w:pStyle w:val="Heading2"/>
+        <w:spacing w:after="100" w:before="240"/>
+      </w:pPr>
+      <w:r>
+        <w:t xml:space="preserve">5. Correspondance lettre FP2E → diamètre</w:t>
+      </w:r>
+    </w:p>
+    <w:p>
+      <w:pPr>
+        <w:spacing w:after="120" w:line="276"/>
+      </w:pPr>
+      <w:r>
+        <w:t xml:space="preserve">La 5ᵉ position du numéro FP2E (une lettre) indique le diamètre attendu. Quand une lettre accepte plusieurs diamètres, le premier listé sert de correction proposée (pour G, la correction proposée est 65).</w:t>
+      </w:r>
+    </w:p>
+    <w:tbl>
+      <w:tblPr>
+        <w:tblW w:type="dxa" w:w="9400"/>
+        <w:tblBorders>
+          <w:top w:val="single" w:color="CED4DA" w:sz="4"/>
+          <w:left w:val="single" w:color="CED4DA" w:sz="4"/>
+          <w:bottom w:val="single" w:color="CED4DA" w:sz="4"/>
+          <w:right w:val="single" w:color="CED4DA" w:sz="4"/>
+          <w:insideH w:val="single" w:color="DEE2E6" w:sz="4"/>
+          <w:insideV w:val="single" w:color="DEE2E6" w:sz="4"/>
+        </w:tblBorders>
+      </w:tblPr>
+      <w:tblGrid>
+        <w:gridCol w:w="3000"/>
+        <w:gridCol w:w="6400"/>
+      </w:tblGrid>
+      <w:tr>
+        <w:trPr>
+          <w:tblHeader/>
+        </w:trPr>
+        <w:tc>
+          <w:tcPr>
+            <w:tcW w:type="dxa" w:w="3000"/>
+            <w:shd w:fill="198754" w:color="auto" w:val="clear"/>
+            <w:tcMar>
+              <w:top w:type="dxa" w:w="60"/>
+              <w:left w:type="dxa" w:w="100"/>
+              <w:bottom w:type="dxa" w:w="60"/>
+              <w:right w:type="dxa" w:w="100"/>
+            </w:tcMar>
+          </w:tcPr>
+          <w:p>
+            <w:r>
+              <w:rPr>
+                <w:b/>
+                <w:bCs/>
+                <w:color w:val="FFFFFF"/>
+                <w:sz w:val="19"/>
+                <w:szCs w:val="19"/>
+              </w:rPr>
+              <w:t xml:space="preserve">Lettre</w:t>
+            </w:r>
+          </w:p>
+        </w:tc>
+        <w:tc>
+          <w:tcPr>
+            <w:tcW w:type="dxa" w:w="6400"/>
+            <w:shd w:fill="198754" w:color="auto" w:val="clear"/>
+            <w:tcMar>
+              <w:top w:type="dxa" w:w="60"/>
+              <w:left w:type="dxa" w:w="100"/>
+              <w:bottom w:type="dxa" w:w="60"/>
+              <w:right w:type="dxa" w:w="100"/>
+            </w:tcMar>
+          </w:tcPr>
+          <w:p>
+            <w:r>
+              <w:rPr>
+                <w:b/>
+                <w:bCs/>
+                <w:color w:val="FFFFFF"/>
+                <w:sz w:val="19"/>
+                <w:szCs w:val="19"/>
+              </w:rPr>
+              <w:t xml:space="preserve">Diamètre (mm)</w:t>
+            </w:r>
+          </w:p>
+        </w:tc>
+      </w:tr>
+      <w:tr>
+        <w:tc>
+          <w:tcPr>
+            <w:tcW w:type="dxa" w:w="3000"/>
+            <w:shd w:fill="FFFFFF" w:color="auto" w:val="clear"/>
+            <w:tcMar>
+              <w:top w:type="dxa" w:w="60"/>
+              <w:left w:type="dxa" w:w="100"/>
+              <w:bottom w:type="dxa" w:w="60"/>
+              <w:right w:type="dxa" w:w="100"/>
+            </w:tcMar>
+          </w:tcPr>
+          <w:p>
+            <w:r>
+              <w:rPr>
+                <w:b w:val="false"/>
+                <w:bCs w:val="false"/>
+                <w:color w:val="212529"/>
+                <w:sz w:val="19"/>
+                <w:szCs w:val="19"/>
+              </w:rPr>
+              <w:t xml:space="preserve">A / U</w:t>
+            </w:r>
+          </w:p>
+        </w:tc>
+        <w:tc>
+          <w:tcPr>
+            <w:tcW w:type="dxa" w:w="6400"/>
+            <w:shd w:fill="FFFFFF" w:color="auto" w:val="clear"/>
+            <w:tcMar>
+              <w:top w:type="dxa" w:w="60"/>
+              <w:left w:type="dxa" w:w="100"/>
+              <w:bottom w:type="dxa" w:w="60"/>
+              <w:right w:type="dxa" w:w="100"/>
+            </w:tcMar>
+          </w:tcPr>
+          <w:p>
+            <w:r>
+              <w:rPr>
+                <w:b w:val="false"/>
+                <w:bCs w:val="false"/>
+                <w:color w:val="212529"/>
+                <w:sz w:val="19"/>
+                <w:szCs w:val="19"/>
+              </w:rPr>
+              <w:t xml:space="preserve">15</w:t>
+            </w:r>
+          </w:p>
+        </w:tc>
+      </w:tr>
+      <w:tr>
+        <w:tc>
+          <w:tcPr>
+            <w:tcW w:type="dxa" w:w="3000"/>
+            <w:shd w:fill="FFFFFF" w:color="auto" w:val="clear"/>
+            <w:tcMar>
+              <w:top w:type="dxa" w:w="60"/>
+              <w:left w:type="dxa" w:w="100"/>
+              <w:bottom w:type="dxa" w:w="60"/>
+              <w:right w:type="dxa" w:w="100"/>
+            </w:tcMar>
+          </w:tcPr>
+          <w:p>
+            <w:r>
+              <w:rPr>
+                <w:b w:val="false"/>
+                <w:bCs w:val="false"/>
+                <w:color w:val="212529"/>
+                <w:sz w:val="19"/>
+                <w:szCs w:val="19"/>
+              </w:rPr>
+              <w:t xml:space="preserve">B</w:t>
+            </w:r>
+          </w:p>
+        </w:tc>
+        <w:tc>
+          <w:tcPr>
+            <w:tcW w:type="dxa" w:w="6400"/>
+            <w:shd w:fill="FFFFFF" w:color="auto" w:val="clear"/>
+            <w:tcMar>
+              <w:top w:type="dxa" w:w="60"/>
+              <w:left w:type="dxa" w:w="100"/>
+              <w:bottom w:type="dxa" w:w="60"/>
+              <w:right w:type="dxa" w:w="100"/>
+            </w:tcMar>
+          </w:tcPr>
+          <w:p>
+            <w:r>
+              <w:rPr>
+                <w:b w:val="false"/>
+                <w:bCs w:val="false"/>
+                <w:color w:val="212529"/>
+                <w:sz w:val="19"/>
+                <w:szCs w:val="19"/>
+              </w:rPr>
+              <w:t xml:space="preserve">20</w:t>
+            </w:r>
+          </w:p>
+        </w:tc>
+      </w:tr>
+      <w:tr>
+        <w:tc>
+          <w:tcPr>
+            <w:tcW w:type="dxa" w:w="3000"/>
+            <w:shd w:fill="FFFFFF" w:color="auto" w:val="clear"/>
+            <w:tcMar>
+              <w:top w:type="dxa" w:w="60"/>
+              <w:left w:type="dxa" w:w="100"/>
+              <w:bottom w:type="dxa" w:w="60"/>
+              <w:right w:type="dxa" w:w="100"/>
+            </w:tcMar>
+          </w:tcPr>
+          <w:p>
+            <w:r>
+              <w:rPr>
+                <w:b w:val="false"/>
+                <w:bCs w:val="false"/>
+                <w:color w:val="212529"/>
+                <w:sz w:val="19"/>
+                <w:szCs w:val="19"/>
+              </w:rPr>
+              <w:t xml:space="preserve">C</w:t>
+            </w:r>
+          </w:p>
+        </w:tc>
+        <w:tc>
+          <w:tcPr>
+            <w:tcW w:type="dxa" w:w="6400"/>
+            <w:shd w:fill="FFFFFF" w:color="auto" w:val="clear"/>
+            <w:tcMar>
+              <w:top w:type="dxa" w:w="60"/>
+              <w:left w:type="dxa" w:w="100"/>
+              <w:bottom w:type="dxa" w:w="60"/>
+              <w:right w:type="dxa" w:w="100"/>
+            </w:tcMar>
+          </w:tcPr>
+          <w:p>
+            <w:r>
+              <w:rPr>
+                <w:b w:val="false"/>
+                <w:bCs w:val="false"/>
+                <w:color w:val="212529"/>
+                <w:sz w:val="19"/>
+                <w:szCs w:val="19"/>
+              </w:rPr>
+              <w:t xml:space="preserve">25</w:t>
+            </w:r>
+          </w:p>
+        </w:tc>
+      </w:tr>
+      <w:tr>
+        <w:tc>
+          <w:tcPr>
+            <w:tcW w:type="dxa" w:w="3000"/>
+            <w:shd w:fill="FFFFFF" w:color="auto" w:val="clear"/>
+            <w:tcMar>
+              <w:top w:type="dxa" w:w="60"/>
+              <w:left w:type="dxa" w:w="100"/>
+              <w:bottom w:type="dxa" w:w="60"/>
+              <w:right w:type="dxa" w:w="100"/>
+            </w:tcMar>
+          </w:tcPr>
+          <w:p>
+            <w:r>
+              <w:rPr>
+                <w:b w:val="false"/>
+                <w:bCs w:val="false"/>
+                <w:color w:val="212529"/>
+                <w:sz w:val="19"/>
+                <w:szCs w:val="19"/>
+              </w:rPr>
+              <w:t xml:space="preserve">D</w:t>
+            </w:r>
+          </w:p>
+        </w:tc>
+        <w:tc>
+          <w:tcPr>
+            <w:tcW w:type="dxa" w:w="6400"/>
+            <w:shd w:fill="FFFFFF" w:color="auto" w:val="clear"/>
+            <w:tcMar>
+              <w:top w:type="dxa" w:w="60"/>
+              <w:left w:type="dxa" w:w="100"/>
+              <w:bottom w:type="dxa" w:w="60"/>
+              <w:right w:type="dxa" w:w="100"/>
+            </w:tcMar>
+          </w:tcPr>
+          <w:p>
+            <w:r>
+              <w:rPr>
+                <w:b w:val="false"/>
+                <w:bCs w:val="false"/>
+                <w:color w:val="212529"/>
+                <w:sz w:val="19"/>
+                <w:szCs w:val="19"/>
+              </w:rPr>
+              <w:t xml:space="preserve">30</w:t>
+            </w:r>
+          </w:p>
+        </w:tc>
+      </w:tr>
+      <w:tr>
+        <w:tc>
+          <w:tcPr>
+            <w:tcW w:type="dxa" w:w="3000"/>
+            <w:shd w:fill="FFFFFF" w:color="auto" w:val="clear"/>
+            <w:tcMar>
+              <w:top w:type="dxa" w:w="60"/>
+              <w:left w:type="dxa" w:w="100"/>
+              <w:bottom w:type="dxa" w:w="60"/>
+              <w:right w:type="dxa" w:w="100"/>
+            </w:tcMar>
+          </w:tcPr>
+          <w:p>
+            <w:r>
+              <w:rPr>
+                <w:b w:val="false"/>
+                <w:bCs w:val="false"/>
+                <w:color w:val="212529"/>
+                <w:sz w:val="19"/>
+                <w:szCs w:val="19"/>
+              </w:rPr>
+              <w:t xml:space="preserve">E</w:t>
+            </w:r>
+          </w:p>
+        </w:tc>
+        <w:tc>
+          <w:tcPr>
+            <w:tcW w:type="dxa" w:w="6400"/>
+            <w:shd w:fill="FFFFFF" w:color="auto" w:val="clear"/>
+            <w:tcMar>
+              <w:top w:type="dxa" w:w="60"/>
+              <w:left w:type="dxa" w:w="100"/>
+              <w:bottom w:type="dxa" w:w="60"/>
+              <w:right w:type="dxa" w:w="100"/>
+            </w:tcMar>
+          </w:tcPr>
+          <w:p>
+            <w:r>
+              <w:rPr>
+                <w:b w:val="false"/>
+                <w:bCs w:val="false"/>
+                <w:color w:val="212529"/>
+                <w:sz w:val="19"/>
+                <w:szCs w:val="19"/>
+              </w:rPr>
+              <w:t xml:space="preserve">40</w:t>
+            </w:r>
+          </w:p>
+        </w:tc>
+      </w:tr>
+      <w:tr>
+        <w:tc>
+          <w:tcPr>
+            <w:tcW w:type="dxa" w:w="3000"/>
+            <w:shd w:fill="FFFFFF" w:color="auto" w:val="clear"/>
+            <w:tcMar>
+              <w:top w:type="dxa" w:w="60"/>
+              <w:left w:type="dxa" w:w="100"/>
+              <w:bottom w:type="dxa" w:w="60"/>
+              <w:right w:type="dxa" w:w="100"/>
+            </w:tcMar>
+          </w:tcPr>
+          <w:p>
+            <w:r>
+              <w:rPr>
+                <w:b w:val="false"/>
+                <w:bCs w:val="false"/>
+                <w:color w:val="212529"/>
+                <w:sz w:val="19"/>
+                <w:szCs w:val="19"/>
+              </w:rPr>
+              <w:t xml:space="preserve">F</w:t>
+            </w:r>
+          </w:p>
+        </w:tc>
+        <w:tc>
+          <w:tcPr>
+            <w:tcW w:type="dxa" w:w="6400"/>
+            <w:shd w:fill="FFFFFF" w:color="auto" w:val="clear"/>
+            <w:tcMar>
+              <w:top w:type="dxa" w:w="60"/>
+              <w:left w:type="dxa" w:w="100"/>
+              <w:bottom w:type="dxa" w:w="60"/>
+              <w:right w:type="dxa" w:w="100"/>
+            </w:tcMar>
+          </w:tcPr>
+          <w:p>
+            <w:r>
+              <w:rPr>
+                <w:b w:val="false"/>
+                <w:bCs w:val="false"/>
+                <w:color w:val="212529"/>
+                <w:sz w:val="19"/>
+                <w:szCs w:val="19"/>
+              </w:rPr>
+              <w:t xml:space="preserve">50</w:t>
+            </w:r>
+          </w:p>
+        </w:tc>
+      </w:tr>
+      <w:tr>
+        <w:tc>
+          <w:tcPr>
+            <w:tcW w:type="dxa" w:w="3000"/>
+            <w:shd w:fill="FFFFFF" w:color="auto" w:val="clear"/>
+            <w:tcMar>
+              <w:top w:type="dxa" w:w="60"/>
+              <w:left w:type="dxa" w:w="100"/>
+              <w:bottom w:type="dxa" w:w="60"/>
+              <w:right w:type="dxa" w:w="100"/>
+            </w:tcMar>
+          </w:tcPr>
+          <w:p>
+            <w:r>
+              <w:rPr>
+                <w:b w:val="false"/>
+                <w:bCs w:val="false"/>
+                <w:color w:val="212529"/>
+                <w:sz w:val="19"/>
+                <w:szCs w:val="19"/>
+              </w:rPr>
+              <w:t xml:space="preserve">G</w:t>
+            </w:r>
+          </w:p>
+        </w:tc>
+        <w:tc>
+          <w:tcPr>
+            <w:tcW w:type="dxa" w:w="6400"/>
+            <w:shd w:fill="FFFFFF" w:color="auto" w:val="clear"/>
+            <w:tcMar>
+              <w:top w:type="dxa" w:w="60"/>
+              <w:left w:type="dxa" w:w="100"/>
+              <w:bottom w:type="dxa" w:w="60"/>
+              <w:right w:type="dxa" w:w="100"/>
+            </w:tcMar>
+          </w:tcPr>
+          <w:p>
+            <w:r>
+              <w:rPr>
+                <w:b w:val="false"/>
+                <w:bCs w:val="false"/>
+                <w:color w:val="212529"/>
+                <w:sz w:val="19"/>
+                <w:szCs w:val="19"/>
+              </w:rPr>
+              <w:t xml:space="preserve">60 ou 65 (correction proposée : 65)</w:t>
+            </w:r>
+          </w:p>
+        </w:tc>
+      </w:tr>
+      <w:tr>
+        <w:tc>
+          <w:tcPr>
+            <w:tcW w:type="dxa" w:w="3000"/>
+            <w:shd w:fill="FFFFFF" w:color="auto" w:val="clear"/>
+            <w:tcMar>
+              <w:top w:type="dxa" w:w="60"/>
+              <w:left w:type="dxa" w:w="100"/>
+              <w:bottom w:type="dxa" w:w="60"/>
+              <w:right w:type="dxa" w:w="100"/>
+            </w:tcMar>
+          </w:tcPr>
+          <w:p>
+            <w:r>
+              <w:rPr>
+                <w:b w:val="false"/>
+                <w:bCs w:val="false"/>
+                <w:color w:val="212529"/>
+                <w:sz w:val="19"/>
+                <w:szCs w:val="19"/>
+              </w:rPr>
+              <w:t xml:space="preserve">H</w:t>
+            </w:r>
+          </w:p>
+        </w:tc>
+        <w:tc>
+          <w:tcPr>
+            <w:tcW w:type="dxa" w:w="6400"/>
+            <w:shd w:fill="FFFFFF" w:color="auto" w:val="clear"/>
+            <w:tcMar>
+              <w:top w:type="dxa" w:w="60"/>
+              <w:left w:type="dxa" w:w="100"/>
+              <w:bottom w:type="dxa" w:w="60"/>
+              <w:right w:type="dxa" w:w="100"/>
+            </w:tcMar>
+          </w:tcPr>
+          <w:p>
+            <w:r>
+              <w:rPr>
+                <w:b w:val="false"/>
+                <w:bCs w:val="false"/>
+                <w:color w:val="212529"/>
+                <w:sz w:val="19"/>
+                <w:szCs w:val="19"/>
+              </w:rPr>
+              <w:t xml:space="preserve">80</w:t>
+            </w:r>
+          </w:p>
+        </w:tc>
+      </w:tr>
+      <w:tr>
+        <w:tc>
+          <w:tcPr>
+            <w:tcW w:type="dxa" w:w="3000"/>
+            <w:shd w:fill="FFFFFF" w:color="auto" w:val="clear"/>
+            <w:tcMar>
+              <w:top w:type="dxa" w:w="60"/>
+              <w:left w:type="dxa" w:w="100"/>
+              <w:bottom w:type="dxa" w:w="60"/>
+              <w:right w:type="dxa" w:w="100"/>
+            </w:tcMar>
+          </w:tcPr>
+          <w:p>
+            <w:r>
+              <w:rPr>
+                <w:b w:val="false"/>
+                <w:bCs w:val="false"/>
+                <w:color w:val="212529"/>
+                <w:sz w:val="19"/>
+                <w:szCs w:val="19"/>
+              </w:rPr>
+              <w:t xml:space="preserve">I</w:t>
+            </w:r>
+          </w:p>
+        </w:tc>
+        <w:tc>
+          <w:tcPr>
+            <w:tcW w:type="dxa" w:w="6400"/>
+            <w:shd w:fill="FFFFFF" w:color="auto" w:val="clear"/>
+            <w:tcMar>
+              <w:top w:type="dxa" w:w="60"/>
+              <w:left w:type="dxa" w:w="100"/>
+              <w:bottom w:type="dxa" w:w="60"/>
+              <w:right w:type="dxa" w:w="100"/>
+            </w:tcMar>
+          </w:tcPr>
+          <w:p>
+            <w:r>
+              <w:rPr>
+                <w:b w:val="false"/>
+                <w:bCs w:val="false"/>
+                <w:color w:val="212529"/>
+                <w:sz w:val="19"/>
+                <w:szCs w:val="19"/>
+              </w:rPr>
+              <w:t xml:space="preserve">100</w:t>
+            </w:r>
+          </w:p>
+        </w:tc>
+      </w:tr>
+      <w:tr>
+        <w:tc>
+          <w:tcPr>
+            <w:tcW w:type="dxa" w:w="3000"/>
+            <w:shd w:fill="FFFFFF" w:color="auto" w:val="clear"/>
+            <w:tcMar>
+              <w:top w:type="dxa" w:w="60"/>
+              <w:left w:type="dxa" w:w="100"/>
+              <w:bottom w:type="dxa" w:w="60"/>
+              <w:right w:type="dxa" w:w="100"/>
+            </w:tcMar>
+          </w:tcPr>
+          <w:p>
+            <w:r>
+              <w:rPr>
+                <w:b w:val="false"/>
+                <w:bCs w:val="false"/>
+                <w:color w:val="212529"/>
+                <w:sz w:val="19"/>
+                <w:szCs w:val="19"/>
+              </w:rPr>
+              <w:t xml:space="preserve">J</w:t>
+            </w:r>
+          </w:p>
+        </w:tc>
+        <w:tc>
+          <w:tcPr>
+            <w:tcW w:type="dxa" w:w="6400"/>
+            <w:shd w:fill="FFFFFF" w:color="auto" w:val="clear"/>
+            <w:tcMar>
+              <w:top w:type="dxa" w:w="60"/>
+              <w:left w:type="dxa" w:w="100"/>
+              <w:bottom w:type="dxa" w:w="60"/>
+              <w:right w:type="dxa" w:w="100"/>
+            </w:tcMar>
+          </w:tcPr>
+          <w:p>
+            <w:r>
+              <w:rPr>
+                <w:b w:val="false"/>
+                <w:bCs w:val="false"/>
+                <w:color w:val="212529"/>
+                <w:sz w:val="19"/>
+                <w:szCs w:val="19"/>
+              </w:rPr>
+              <w:t xml:space="preserve">125</w:t>
+            </w:r>
+          </w:p>
+        </w:tc>
+      </w:tr>
+      <w:tr>
+        <w:tc>
+          <w:tcPr>
+            <w:tcW w:type="dxa" w:w="3000"/>
+            <w:shd w:fill="FFFFFF" w:color="auto" w:val="clear"/>
+            <w:tcMar>
+              <w:top w:type="dxa" w:w="60"/>
+              <w:left w:type="dxa" w:w="100"/>
+              <w:bottom w:type="dxa" w:w="60"/>
+              <w:right w:type="dxa" w:w="100"/>
+            </w:tcMar>
+          </w:tcPr>
+          <w:p>
+            <w:r>
+              <w:rPr>
+                <w:b w:val="false"/>
+                <w:bCs w:val="false"/>
+                <w:color w:val="212529"/>
+                <w:sz w:val="19"/>
+                <w:szCs w:val="19"/>
+              </w:rPr>
+              <w:t xml:space="preserve">K</w:t>
+            </w:r>
+          </w:p>
+        </w:tc>
+        <w:tc>
+          <w:tcPr>
+            <w:tcW w:type="dxa" w:w="6400"/>
+            <w:shd w:fill="FFFFFF" w:color="auto" w:val="clear"/>
+            <w:tcMar>
+              <w:top w:type="dxa" w:w="60"/>
+              <w:left w:type="dxa" w:w="100"/>
+              <w:bottom w:type="dxa" w:w="60"/>
+              <w:right w:type="dxa" w:w="100"/>
+            </w:tcMar>
+          </w:tcPr>
+          <w:p>
+            <w:r>
+              <w:rPr>
+                <w:b w:val="false"/>
+                <w:bCs w:val="false"/>
+                <w:color w:val="212529"/>
+                <w:sz w:val="19"/>
+                <w:szCs w:val="19"/>
+              </w:rPr>
+              <w:t xml:space="preserve">150</w:t>
+            </w:r>
+          </w:p>
+        </w:tc>
+      </w:tr>
+      <w:tr>
+        <w:tc>
+          <w:tcPr>
+            <w:tcW w:type="dxa" w:w="3000"/>
+            <w:shd w:fill="FFFFFF" w:color="auto" w:val="clear"/>
+            <w:tcMar>
+              <w:top w:type="dxa" w:w="60"/>
+              <w:left w:type="dxa" w:w="100"/>
+              <w:bottom w:type="dxa" w:w="60"/>
+              <w:right w:type="dxa" w:w="100"/>
+            </w:tcMar>
+          </w:tcPr>
+          <w:p>
+            <w:r>
+              <w:rPr>
+                <w:b w:val="false"/>
+                <w:bCs w:val="false"/>
+                <w:color w:val="212529"/>
+                <w:sz w:val="19"/>
+                <w:szCs w:val="19"/>
+              </w:rPr>
+              <w:t xml:space="preserve">L</w:t>
+            </w:r>
+          </w:p>
+        </w:tc>
+        <w:tc>
+          <w:tcPr>
+            <w:tcW w:type="dxa" w:w="6400"/>
+            <w:shd w:fill="FFFFFF" w:color="auto" w:val="clear"/>
+            <w:tcMar>
+              <w:top w:type="dxa" w:w="60"/>
+              <w:left w:type="dxa" w:w="100"/>
+              <w:bottom w:type="dxa" w:w="60"/>
+              <w:right w:type="dxa" w:w="100"/>
+            </w:tcMar>
+          </w:tcPr>
+          <w:p>
+            <w:r>
+              <w:rPr>
+                <w:b w:val="false"/>
+                <w:bCs w:val="false"/>
+                <w:color w:val="212529"/>
+                <w:sz w:val="19"/>
+                <w:szCs w:val="19"/>
+              </w:rPr>
+              <w:t xml:space="preserve">200</w:t>
+            </w:r>
+          </w:p>
+        </w:tc>
+      </w:tr>
+      <w:tr>
+        <w:tc>
+          <w:tcPr>
+            <w:tcW w:type="dxa" w:w="3000"/>
+            <w:shd w:fill="FFFFFF" w:color="auto" w:val="clear"/>
+            <w:tcMar>
+              <w:top w:type="dxa" w:w="60"/>
+              <w:left w:type="dxa" w:w="100"/>
+              <w:bottom w:type="dxa" w:w="60"/>
+              <w:right w:type="dxa" w:w="100"/>
+            </w:tcMar>
+          </w:tcPr>
+          <w:p>
+            <w:r>
+              <w:rPr>
+                <w:b w:val="false"/>
+                <w:bCs w:val="false"/>
+                <w:color w:val="212529"/>
+                <w:sz w:val="19"/>
+                <w:szCs w:val="19"/>
+              </w:rPr>
+              <w:t xml:space="preserve">M</w:t>
+            </w:r>
+          </w:p>
+        </w:tc>
+        <w:tc>
+          <w:tcPr>
+            <w:tcW w:type="dxa" w:w="6400"/>
+            <w:shd w:fill="FFFFFF" w:color="auto" w:val="clear"/>
+            <w:tcMar>
+              <w:top w:type="dxa" w:w="60"/>
+              <w:left w:type="dxa" w:w="100"/>
+              <w:bottom w:type="dxa" w:w="60"/>
+              <w:right w:type="dxa" w:w="100"/>
+            </w:tcMar>
+          </w:tcPr>
+          <w:p>
+            <w:r>
+              <w:rPr>
+                <w:b w:val="false"/>
+                <w:bCs w:val="false"/>
+                <w:color w:val="212529"/>
+                <w:sz w:val="19"/>
+                <w:szCs w:val="19"/>
+              </w:rPr>
+              <w:t xml:space="preserve">250</w:t>
+            </w:r>
+          </w:p>
+        </w:tc>
+      </w:tr>
+      <w:tr>
+        <w:tc>
+          <w:tcPr>
+            <w:tcW w:type="dxa" w:w="3000"/>
+            <w:shd w:fill="FFFFFF" w:color="auto" w:val="clear"/>
+            <w:tcMar>
+              <w:top w:type="dxa" w:w="60"/>
+              <w:left w:type="dxa" w:w="100"/>
+              <w:bottom w:type="dxa" w:w="60"/>
+              <w:right w:type="dxa" w:w="100"/>
+            </w:tcMar>
+          </w:tcPr>
+          <w:p>
+            <w:r>
+              <w:rPr>
+                <w:b w:val="false"/>
+                <w:bCs w:val="false"/>
+                <w:color w:val="212529"/>
+                <w:sz w:val="19"/>
+                <w:szCs w:val="19"/>
+              </w:rPr>
+              <w:t xml:space="preserve">N</w:t>
+            </w:r>
+          </w:p>
+        </w:tc>
+        <w:tc>
+          <w:tcPr>
+            <w:tcW w:type="dxa" w:w="6400"/>
+            <w:shd w:fill="FFFFFF" w:color="auto" w:val="clear"/>
+            <w:tcMar>
+              <w:top w:type="dxa" w:w="60"/>
+              <w:left w:type="dxa" w:w="100"/>
+              <w:bottom w:type="dxa" w:w="60"/>
+              <w:right w:type="dxa" w:w="100"/>
+            </w:tcMar>
+          </w:tcPr>
+          <w:p>
+            <w:r>
+              <w:rPr>
+                <w:b w:val="false"/>
+                <w:bCs w:val="false"/>
+                <w:color w:val="212529"/>
+                <w:sz w:val="19"/>
+                <w:szCs w:val="19"/>
+              </w:rPr>
+              <w:t xml:space="preserve">300</w:t>
+            </w:r>
+          </w:p>
+        </w:tc>
+      </w:tr>
+      <w:tr>
+        <w:tc>
+          <w:tcPr>
+            <w:tcW w:type="dxa" w:w="3000"/>
+            <w:shd w:fill="FFFFFF" w:color="auto" w:val="clear"/>
+            <w:tcMar>
+              <w:top w:type="dxa" w:w="60"/>
+              <w:left w:type="dxa" w:w="100"/>
+              <w:bottom w:type="dxa" w:w="60"/>
+              <w:right w:type="dxa" w:w="100"/>
+            </w:tcMar>
+          </w:tcPr>
+          <w:p>
+            <w:r>
+              <w:rPr>
+                <w:b w:val="false"/>
+                <w:bCs w:val="false"/>
+                <w:color w:val="212529"/>
+                <w:sz w:val="19"/>
+                <w:szCs w:val="19"/>
+              </w:rPr>
+              <w:t xml:space="preserve">O</w:t>
+            </w:r>
+          </w:p>
+        </w:tc>
+        <w:tc>
+          <w:tcPr>
+            <w:tcW w:type="dxa" w:w="6400"/>
+            <w:shd w:fill="FFFFFF" w:color="auto" w:val="clear"/>
+            <w:tcMar>
+              <w:top w:type="dxa" w:w="60"/>
+              <w:left w:type="dxa" w:w="100"/>
+              <w:bottom w:type="dxa" w:w="60"/>
+              <w:right w:type="dxa" w:w="100"/>
+            </w:tcMar>
+          </w:tcPr>
+          <w:p>
+            <w:r>
+              <w:rPr>
+                <w:b w:val="false"/>
+                <w:bCs w:val="false"/>
+                <w:color w:val="212529"/>
+                <w:sz w:val="19"/>
+                <w:szCs w:val="19"/>
+              </w:rPr>
+              <w:t xml:space="preserve">350</w:t>
+            </w:r>
+          </w:p>
+        </w:tc>
+      </w:tr>
+      <w:tr>
+        <w:tc>
+          <w:tcPr>
+            <w:tcW w:type="dxa" w:w="3000"/>
+            <w:shd w:fill="FFFFFF" w:color="auto" w:val="clear"/>
+            <w:tcMar>
+              <w:top w:type="dxa" w:w="60"/>
+              <w:left w:type="dxa" w:w="100"/>
+              <w:bottom w:type="dxa" w:w="60"/>
+              <w:right w:type="dxa" w:w="100"/>
+            </w:tcMar>
+          </w:tcPr>
+          <w:p>
+            <w:r>
+              <w:rPr>
+                <w:b w:val="false"/>
+                <w:bCs w:val="false"/>
+                <w:color w:val="212529"/>
+                <w:sz w:val="19"/>
+                <w:szCs w:val="19"/>
+              </w:rPr>
+              <w:t xml:space="preserve">P</w:t>
+            </w:r>
+          </w:p>
+        </w:tc>
+        <w:tc>
+          <w:tcPr>
+            <w:tcW w:type="dxa" w:w="6400"/>
+            <w:shd w:fill="FFFFFF" w:color="auto" w:val="clear"/>
+            <w:tcMar>
+              <w:top w:type="dxa" w:w="60"/>
+              <w:left w:type="dxa" w:w="100"/>
+              <w:bottom w:type="dxa" w:w="60"/>
+              <w:right w:type="dxa" w:w="100"/>
+            </w:tcMar>
+          </w:tcPr>
+          <w:p>
+            <w:r>
+              <w:rPr>
+                <w:b w:val="false"/>
+                <w:bCs w:val="false"/>
+                <w:color w:val="212529"/>
+                <w:sz w:val="19"/>
+                <w:szCs w:val="19"/>
+              </w:rPr>
+              <w:t xml:space="preserve">400</w:t>
             </w:r>
           </w:p>
         </w:tc>

</xml_diff>